<commit_message>
Remove obsolete .gitkeep files from various directories and update existing documents in the Ciclo-2024-Segundo-Semestre and Ciclo-2025-Segundo-Semestre. Add new .gitkeep file for Ciclo-2026-Primer-Semestre.
</commit_message>
<xml_diff>
--- a/Ciclo-2024-Segundo-Semestre/Contenido/Prácticas/Prácticas Sugeridas.docx
+++ b/Ciclo-2024-Segundo-Semestre/Contenido/Prácticas/Prácticas Sugeridas.docx
@@ -7,6 +7,7 @@
         <w:spacing w:line="256" w:lineRule="auto"/>
         <w:rPr>
           <w:b w:val="1"/>
+          <w:bCs w:val="1"/>
           <w:sz w:val="24"/>
           <w:szCs w:val="24"/>
         </w:rPr>
@@ -14,6 +15,7 @@
       <w:r>
         <w:rPr>
           <w:b w:val="1"/>
+          <w:bCs w:val="1"/>
           <w:sz w:val="24"/>
           <w:szCs w:val="24"/>
           <w:rtl w:val="0"/>
@@ -26,6 +28,7 @@
         <w:spacing w:line="256" w:lineRule="auto"/>
         <w:rPr>
           <w:b w:val="1"/>
+          <w:bCs w:val="1"/>
           <w:sz w:val="24"/>
           <w:szCs w:val="24"/>
         </w:rPr>
@@ -33,6 +36,7 @@
       <w:r>
         <w:rPr>
           <w:b w:val="1"/>
+          <w:bCs w:val="1"/>
           <w:sz w:val="24"/>
           <w:szCs w:val="24"/>
           <w:rtl w:val="0"/>
@@ -62,7 +66,7 @@
                   </pic:nvPicPr>
                   <pic:blipFill>
                     <a:blip r:embed="rId6"/>
-                    <a:srcRect b="10839" l="13099" r="19396" t="19747"/>
+                    <a:srcRect b="10840" l="13099" r="19396" t="19748"/>
                     <a:stretch>
                       <a:fillRect/>
                     </a:stretch>
@@ -87,6 +91,7 @@
         <w:spacing w:line="256" w:lineRule="auto"/>
         <w:rPr>
           <w:b w:val="1"/>
+          <w:bCs w:val="1"/>
           <w:sz w:val="24"/>
           <w:szCs w:val="24"/>
         </w:rPr>
@@ -94,6 +99,7 @@
       <w:r>
         <w:rPr>
           <w:b w:val="1"/>
+          <w:bCs w:val="1"/>
           <w:sz w:val="24"/>
           <w:szCs w:val="24"/>
           <w:rtl w:val="0"/>
@@ -106,6 +112,7 @@
         <w:spacing w:line="256" w:lineRule="auto"/>
         <w:rPr>
           <w:b w:val="1"/>
+          <w:bCs w:val="1"/>
           <w:sz w:val="24"/>
           <w:szCs w:val="24"/>
         </w:rPr>
@@ -113,6 +120,7 @@
       <w:r>
         <w:rPr>
           <w:b w:val="1"/>
+          <w:bCs w:val="1"/>
           <w:sz w:val="24"/>
           <w:szCs w:val="24"/>
           <w:rtl w:val="0"/>
@@ -125,6 +133,7 @@
         <w:spacing w:line="256" w:lineRule="auto"/>
         <w:rPr>
           <w:b w:val="1"/>
+          <w:bCs w:val="1"/>
           <w:sz w:val="24"/>
           <w:szCs w:val="24"/>
         </w:rPr>
@@ -132,6 +141,7 @@
       <w:r>
         <w:rPr>
           <w:b w:val="1"/>
+          <w:bCs w:val="1"/>
           <w:sz w:val="24"/>
           <w:szCs w:val="24"/>
           <w:rtl w:val="0"/>
@@ -144,6 +154,7 @@
         <w:spacing w:line="256" w:lineRule="auto"/>
         <w:rPr>
           <w:b w:val="1"/>
+          <w:bCs w:val="1"/>
           <w:sz w:val="24"/>
           <w:szCs w:val="24"/>
         </w:rPr>
@@ -151,6 +162,7 @@
       <w:r>
         <w:rPr>
           <w:b w:val="1"/>
+          <w:bCs w:val="1"/>
           <w:sz w:val="24"/>
           <w:szCs w:val="24"/>
           <w:rtl w:val="0"/>
@@ -180,6 +192,7 @@
         <w:spacing w:line="256" w:lineRule="auto"/>
         <w:rPr>
           <w:b w:val="1"/>
+          <w:bCs w:val="1"/>
           <w:sz w:val="24"/>
           <w:szCs w:val="24"/>
         </w:rPr>
@@ -187,6 +200,7 @@
       <w:r>
         <w:rPr>
           <w:b w:val="1"/>
+          <w:bCs w:val="1"/>
           <w:sz w:val="24"/>
           <w:szCs w:val="24"/>
           <w:rtl w:val="0"/>
@@ -234,6 +248,7 @@
         <w:jc w:val="center"/>
         <w:rPr>
           <w:b w:val="1"/>
+          <w:bCs w:val="1"/>
           <w:sz w:val="40"/>
           <w:szCs w:val="40"/>
         </w:rPr>
@@ -241,6 +256,7 @@
       <w:r>
         <w:rPr>
           <w:b w:val="1"/>
+          <w:bCs w:val="1"/>
           <w:sz w:val="40"/>
           <w:szCs w:val="40"/>
           <w:rtl w:val="0"/>
@@ -267,6 +283,7 @@
         <w:pStyle w:val="Heading1"/>
         <w:rPr>
           <w:b w:val="1"/>
+          <w:bCs w:val="1"/>
           <w:color w:val="1155cc"/>
         </w:rPr>
       </w:pPr>
@@ -275,6 +292,7 @@
       <w:r>
         <w:rPr>
           <w:b w:val="1"/>
+          <w:bCs w:val="1"/>
           <w:color w:val="1155cc"/>
           <w:rtl w:val="0"/>
         </w:rPr>
@@ -326,6 +344,7 @@
         <w:pStyle w:val="Heading1"/>
         <w:rPr>
           <w:b w:val="1"/>
+          <w:bCs w:val="1"/>
           <w:color w:val="1155cc"/>
         </w:rPr>
       </w:pPr>
@@ -334,6 +353,7 @@
       <w:r>
         <w:rPr>
           <w:b w:val="1"/>
+          <w:bCs w:val="1"/>
           <w:color w:val="1155cc"/>
           <w:rtl w:val="0"/>
         </w:rPr>
@@ -345,6 +365,7 @@
         <w:pStyle w:val="Heading2"/>
         <w:rPr>
           <w:b w:val="1"/>
+          <w:bCs w:val="1"/>
           <w:color w:val="1155cc"/>
         </w:rPr>
       </w:pPr>
@@ -353,6 +374,7 @@
       <w:r>
         <w:rPr>
           <w:b w:val="1"/>
+          <w:bCs w:val="1"/>
           <w:color w:val="1155cc"/>
           <w:rtl w:val="0"/>
         </w:rPr>
@@ -388,6 +410,7 @@
         <w:pStyle w:val="Heading2"/>
         <w:rPr>
           <w:b w:val="1"/>
+          <w:bCs w:val="1"/>
           <w:color w:val="1155cc"/>
         </w:rPr>
       </w:pPr>
@@ -396,6 +419,7 @@
       <w:r>
         <w:rPr>
           <w:b w:val="1"/>
+          <w:bCs w:val="1"/>
           <w:color w:val="1155cc"/>
           <w:rtl w:val="0"/>
         </w:rPr>
@@ -478,6 +502,7 @@
         <w:pStyle w:val="Heading1"/>
         <w:rPr>
           <w:b w:val="1"/>
+          <w:bCs w:val="1"/>
           <w:color w:val="1155cc"/>
         </w:rPr>
       </w:pPr>
@@ -486,6 +511,7 @@
       <w:r>
         <w:rPr>
           <w:b w:val="1"/>
+          <w:bCs w:val="1"/>
           <w:color w:val="1155cc"/>
           <w:rtl w:val="0"/>
         </w:rPr>
@@ -543,11 +569,13 @@
         <w:jc w:val="both"/>
         <w:rPr>
           <w:b w:val="1"/>
-        </w:rPr>
-      </w:pPr>
-      <w:r>
-        <w:rPr>
-          <w:b w:val="1"/>
+          <w:bCs w:val="1"/>
+        </w:rPr>
+      </w:pPr>
+      <w:r>
+        <w:rPr>
+          <w:b w:val="1"/>
+          <w:bCs w:val="1"/>
           <w:rtl w:val="0"/>
         </w:rPr>
         <w:t xml:space="preserve">Las prácticas se dividirán en el siguiente orden y serán desarrolladas, detalladas y explicadas conforme el avance y temas vistos en el laboratorio.</w:t>
@@ -558,6 +586,7 @@
         <w:jc w:val="both"/>
         <w:rPr>
           <w:b w:val="1"/>
+          <w:bCs w:val="1"/>
         </w:rPr>
       </w:pPr>
       <w:r>
@@ -575,6 +604,7 @@
         <w:jc w:val="both"/>
         <w:rPr>
           <w:b w:val="1"/>
+          <w:bCs w:val="1"/>
           <w:color w:val="000000"/>
           <w:sz w:val="26"/>
           <w:szCs w:val="26"/>
@@ -585,6 +615,7 @@
       <w:r>
         <w:rPr>
           <w:b w:val="1"/>
+          <w:bCs w:val="1"/>
           <w:color w:val="000000"/>
           <w:sz w:val="26"/>
           <w:szCs w:val="26"/>
@@ -602,6 +633,7 @@
       <w:r>
         <w:rPr>
           <w:b w:val="1"/>
+          <w:bCs w:val="1"/>
           <w:rtl w:val="0"/>
         </w:rPr>
         <w:t xml:space="preserve">Objetivo:</w:t>
@@ -763,11 +795,13 @@
         <w:jc w:val="both"/>
         <w:rPr>
           <w:b w:val="1"/>
-        </w:rPr>
-      </w:pPr>
-      <w:r>
-        <w:rPr>
-          <w:b w:val="1"/>
+          <w:bCs w:val="1"/>
+        </w:rPr>
+      </w:pPr>
+      <w:r>
+        <w:rPr>
+          <w:b w:val="1"/>
+          <w:bCs w:val="1"/>
           <w:rtl w:val="0"/>
         </w:rPr>
         <w:t xml:space="preserve">Entregables:</w:t>
@@ -875,6 +909,7 @@
         <w:jc w:val="both"/>
         <w:rPr>
           <w:b w:val="1"/>
+          <w:bCs w:val="1"/>
           <w:color w:val="000000"/>
           <w:sz w:val="26"/>
           <w:szCs w:val="26"/>
@@ -885,6 +920,7 @@
       <w:r>
         <w:rPr>
           <w:b w:val="1"/>
+          <w:bCs w:val="1"/>
           <w:color w:val="000000"/>
           <w:sz w:val="26"/>
           <w:szCs w:val="26"/>
@@ -902,6 +938,7 @@
       <w:r>
         <w:rPr>
           <w:b w:val="1"/>
+          <w:bCs w:val="1"/>
           <w:rtl w:val="0"/>
         </w:rPr>
         <w:t xml:space="preserve">Objetivo:</w:t>
@@ -1063,11 +1100,13 @@
         <w:jc w:val="both"/>
         <w:rPr>
           <w:b w:val="1"/>
-        </w:rPr>
-      </w:pPr>
-      <w:r>
-        <w:rPr>
-          <w:b w:val="1"/>
+          <w:bCs w:val="1"/>
+        </w:rPr>
+      </w:pPr>
+      <w:r>
+        <w:rPr>
+          <w:b w:val="1"/>
+          <w:bCs w:val="1"/>
           <w:rtl w:val="0"/>
         </w:rPr>
         <w:t xml:space="preserve">Entregables:</w:t>
@@ -1175,6 +1214,7 @@
         <w:jc w:val="both"/>
         <w:rPr>
           <w:b w:val="1"/>
+          <w:bCs w:val="1"/>
           <w:color w:val="000000"/>
           <w:sz w:val="26"/>
           <w:szCs w:val="26"/>
@@ -1185,6 +1225,7 @@
       <w:r>
         <w:rPr>
           <w:b w:val="1"/>
+          <w:bCs w:val="1"/>
           <w:color w:val="000000"/>
           <w:sz w:val="26"/>
           <w:szCs w:val="26"/>
@@ -1202,6 +1243,7 @@
       <w:r>
         <w:rPr>
           <w:b w:val="1"/>
+          <w:bCs w:val="1"/>
           <w:rtl w:val="0"/>
         </w:rPr>
         <w:t xml:space="preserve">Objetivo:</w:t>
@@ -1219,11 +1261,13 @@
         <w:jc w:val="both"/>
         <w:rPr>
           <w:b w:val="1"/>
-        </w:rPr>
-      </w:pPr>
-      <w:r>
-        <w:rPr>
-          <w:b w:val="1"/>
+          <w:bCs w:val="1"/>
+        </w:rPr>
+      </w:pPr>
+      <w:r>
+        <w:rPr>
+          <w:b w:val="1"/>
+          <w:bCs w:val="1"/>
           <w:rtl w:val="0"/>
         </w:rPr>
         <w:t xml:space="preserve">Microservicios:</w:t>
@@ -1395,11 +1439,13 @@
         <w:jc w:val="both"/>
         <w:rPr>
           <w:b w:val="1"/>
-        </w:rPr>
-      </w:pPr>
-      <w:r>
-        <w:rPr>
-          <w:b w:val="1"/>
+          <w:bCs w:val="1"/>
+        </w:rPr>
+      </w:pPr>
+      <w:r>
+        <w:rPr>
+          <w:b w:val="1"/>
+          <w:bCs w:val="1"/>
           <w:rtl w:val="0"/>
         </w:rPr>
         <w:t xml:space="preserve">Entregables:</w:t>
@@ -1507,6 +1553,7 @@
         <w:jc w:val="both"/>
         <w:rPr>
           <w:b w:val="1"/>
+          <w:bCs w:val="1"/>
           <w:color w:val="000000"/>
           <w:sz w:val="26"/>
           <w:szCs w:val="26"/>
@@ -1517,6 +1564,7 @@
       <w:r>
         <w:rPr>
           <w:b w:val="1"/>
+          <w:bCs w:val="1"/>
           <w:color w:val="000000"/>
           <w:sz w:val="26"/>
           <w:szCs w:val="26"/>
@@ -1534,6 +1582,7 @@
       <w:r>
         <w:rPr>
           <w:b w:val="1"/>
+          <w:bCs w:val="1"/>
           <w:rtl w:val="0"/>
         </w:rPr>
         <w:t xml:space="preserve">Objetivo:</w:t>
@@ -1711,11 +1760,13 @@
         <w:jc w:val="both"/>
         <w:rPr>
           <w:b w:val="1"/>
-        </w:rPr>
-      </w:pPr>
-      <w:r>
-        <w:rPr>
-          <w:b w:val="1"/>
+          <w:bCs w:val="1"/>
+        </w:rPr>
+      </w:pPr>
+      <w:r>
+        <w:rPr>
+          <w:b w:val="1"/>
+          <w:bCs w:val="1"/>
           <w:rtl w:val="0"/>
         </w:rPr>
         <w:t xml:space="preserve">Entregables:</w:t>
@@ -1821,6 +1872,7 @@
         <w:jc w:val="both"/>
         <w:rPr>
           <w:b w:val="1"/>
+          <w:bCs w:val="1"/>
           <w:color w:val="000000"/>
           <w:sz w:val="26"/>
           <w:szCs w:val="26"/>
@@ -1831,6 +1883,7 @@
       <w:r>
         <w:rPr>
           <w:b w:val="1"/>
+          <w:bCs w:val="1"/>
           <w:color w:val="000000"/>
           <w:sz w:val="26"/>
           <w:szCs w:val="26"/>
@@ -1848,6 +1901,7 @@
       <w:r>
         <w:rPr>
           <w:b w:val="1"/>
+          <w:bCs w:val="1"/>
           <w:rtl w:val="0"/>
         </w:rPr>
         <w:t xml:space="preserve">Objetivo:</w:t>
@@ -2073,11 +2127,13 @@
         <w:jc w:val="both"/>
         <w:rPr>
           <w:b w:val="1"/>
-        </w:rPr>
-      </w:pPr>
-      <w:r>
-        <w:rPr>
-          <w:b w:val="1"/>
+          <w:bCs w:val="1"/>
+        </w:rPr>
+      </w:pPr>
+      <w:r>
+        <w:rPr>
+          <w:b w:val="1"/>
+          <w:bCs w:val="1"/>
           <w:rtl w:val="0"/>
         </w:rPr>
         <w:t xml:space="preserve">Entregables:</w:t>
@@ -2194,6 +2250,7 @@
         <w:jc w:val="both"/>
         <w:rPr>
           <w:b w:val="1"/>
+          <w:bCs w:val="1"/>
           <w:color w:val="000000"/>
           <w:sz w:val="26"/>
           <w:szCs w:val="26"/>
@@ -2204,6 +2261,7 @@
       <w:r>
         <w:rPr>
           <w:b w:val="1"/>
+          <w:bCs w:val="1"/>
           <w:color w:val="000000"/>
           <w:sz w:val="26"/>
           <w:szCs w:val="26"/>
@@ -2221,6 +2279,7 @@
       <w:r>
         <w:rPr>
           <w:b w:val="1"/>
+          <w:bCs w:val="1"/>
           <w:rtl w:val="0"/>
         </w:rPr>
         <w:t xml:space="preserve">Objetivo:</w:t>
@@ -2430,11 +2489,13 @@
         <w:jc w:val="both"/>
         <w:rPr>
           <w:b w:val="1"/>
-        </w:rPr>
-      </w:pPr>
-      <w:r>
-        <w:rPr>
-          <w:b w:val="1"/>
+          <w:bCs w:val="1"/>
+        </w:rPr>
+      </w:pPr>
+      <w:r>
+        <w:rPr>
+          <w:b w:val="1"/>
+          <w:bCs w:val="1"/>
           <w:rtl w:val="0"/>
         </w:rPr>
         <w:t xml:space="preserve">Entregables:</w:t>
@@ -2513,6 +2574,7 @@
         <w:jc w:val="both"/>
         <w:rPr>
           <w:b w:val="1"/>
+          <w:bCs w:val="1"/>
           <w:color w:val="000000"/>
           <w:sz w:val="26"/>
           <w:szCs w:val="26"/>
@@ -2523,6 +2585,7 @@
       <w:r>
         <w:rPr>
           <w:b w:val="1"/>
+          <w:bCs w:val="1"/>
           <w:color w:val="000000"/>
           <w:sz w:val="26"/>
           <w:szCs w:val="26"/>
@@ -4588,6 +4651,7 @@
     </w:pPr>
     <w:rPr>
       <w:b w:val="0"/>
+      <w:bCs w:val="0"/>
       <w:sz w:val="32"/>
       <w:szCs w:val="32"/>
     </w:rPr>
@@ -4604,6 +4668,7 @@
     </w:pPr>
     <w:rPr>
       <w:b w:val="0"/>
+      <w:bCs w:val="0"/>
       <w:color w:val="434343"/>
       <w:sz w:val="28"/>
       <w:szCs w:val="28"/>
@@ -4653,6 +4718,7 @@
     </w:pPr>
     <w:rPr>
       <w:i w:val="1"/>
+      <w:iCs w:val="1"/>
       <w:color w:val="666666"/>
       <w:sz w:val="22"/>
       <w:szCs w:val="22"/>
@@ -4686,6 +4752,7 @@
     <w:rPr>
       <w:rFonts w:ascii="Arial" w:cs="Arial" w:eastAsia="Arial" w:hAnsi="Arial"/>
       <w:i w:val="0"/>
+      <w:iCs w:val="0"/>
       <w:color w:val="666666"/>
       <w:sz w:val="30"/>
       <w:szCs w:val="30"/>

</xml_diff>